<commit_message>
feat: Projects section with dynamic project cards and status indicators.
</commit_message>
<xml_diff>
--- a/src/assets/resume/KierVincentOclares_Resume.docx
+++ b/src/assets/resume/KierVincentOclares_Resume.docx
@@ -276,15 +276,7 @@
           <w:b/>
           <w:bCs/>
         </w:rPr>
-        <w:t>Data Analytics &amp; Visualization</w:t>
-      </w:r>
-      <w:r>
-        <w:rPr>
-          <w:rFonts w:ascii="Arial" w:eastAsia="Arial" w:hAnsi="Arial" w:cs="Arial"/>
-          <w:b/>
-          <w:bCs/>
-        </w:rPr>
-        <w:t xml:space="preserve">: </w:t>
+        <w:t xml:space="preserve">Data Analytics &amp; Visualization: </w:t>
       </w:r>
       <w:r>
         <w:rPr>
@@ -326,13 +318,7 @@
         <w:rPr>
           <w:rFonts w:ascii="Arial" w:eastAsia="Arial" w:hAnsi="Arial" w:cs="Arial"/>
         </w:rPr>
-        <w:t xml:space="preserve"> </w:t>
-      </w:r>
-      <w:r>
-        <w:rPr>
-          <w:rFonts w:ascii="Arial" w:eastAsia="Arial" w:hAnsi="Arial" w:cs="Arial"/>
-        </w:rPr>
-        <w:t>SQL (T-SQL, SSIS), ETL/ELT Automation, REST API Integration, Cloud Cost Data Consolidation, Legacy System Migration.</w:t>
+        <w:t xml:space="preserve"> SQL (T-SQL, SSIS), ETL/ELT Automation, REST API Integration, Cloud Cost Data Consolidation, Legacy System Migration.</w:t>
       </w:r>
     </w:p>
     <w:p>
@@ -368,13 +354,7 @@
         <w:rPr>
           <w:rFonts w:ascii="Arial" w:eastAsia="Arial" w:hAnsi="Arial" w:cs="Arial"/>
         </w:rPr>
-        <w:t xml:space="preserve"> </w:t>
-      </w:r>
-      <w:r>
-        <w:rPr>
-          <w:rFonts w:ascii="Arial" w:eastAsia="Arial" w:hAnsi="Arial" w:cs="Arial"/>
-        </w:rPr>
-        <w:t>KPI Development, Policy Impact Analysis, Technical Mentorship/Training, Requirements Elicitation, Ethical Data Analysis.</w:t>
+        <w:t xml:space="preserve"> KPI Development, Policy Impact Analysis, Technical Mentorship/Training, Requirements Elicitation, Ethical Data Analysis.</w:t>
       </w:r>
     </w:p>
     <w:p>
@@ -410,13 +390,7 @@
         <w:rPr>
           <w:rFonts w:ascii="Arial" w:eastAsia="Arial" w:hAnsi="Arial" w:cs="Arial"/>
         </w:rPr>
-        <w:t xml:space="preserve"> </w:t>
-      </w:r>
-      <w:r>
-        <w:rPr>
-          <w:rFonts w:ascii="Arial" w:eastAsia="Arial" w:hAnsi="Arial" w:cs="Arial"/>
-        </w:rPr>
-        <w:t>Git Version Control, Data Governance, User Acceptance Testing (UAT), SDLC Support, Metadata Tracking.</w:t>
+        <w:t xml:space="preserve"> Git Version Control, Data Governance, User Acceptance Testing (UAT), SDLC Support, Metadata Tracking.</w:t>
       </w:r>
     </w:p>
     <w:p>
@@ -656,7 +630,21 @@
         <w:rPr>
           <w:rFonts w:ascii="Arial" w:eastAsia="Arial" w:hAnsi="Arial" w:cs="Arial"/>
         </w:rPr>
-        <w:t>Developed Python-based ETL scripts to pull data from REST APIs, streamlining pre-processing and exploratory data analysis (EDA</w:t>
+        <w:t xml:space="preserve">Developed Python-based ETL scripts to pull data from REST APIs, streamlining pre-processing and </w:t>
+      </w:r>
+      <w:proofErr w:type="gramStart"/>
+      <w:r>
+        <w:rPr>
+          <w:rFonts w:ascii="Arial" w:eastAsia="Arial" w:hAnsi="Arial" w:cs="Arial"/>
+        </w:rPr>
+        <w:t>exploratory</w:t>
+      </w:r>
+      <w:proofErr w:type="gramEnd"/>
+      <w:r>
+        <w:rPr>
+          <w:rFonts w:ascii="Arial" w:eastAsia="Arial" w:hAnsi="Arial" w:cs="Arial"/>
+        </w:rPr>
+        <w:t xml:space="preserve"> data analysis (EDA</w:t>
       </w:r>
       <w:r>
         <w:rPr>
@@ -1450,7 +1438,7 @@
           <w:b/>
           <w:bCs/>
         </w:rPr>
-        <w:t>Contact Centre &amp; AI Chatbot Intent Analysis</w:t>
+        <w:t>AI Chatbot Intent Analysis</w:t>
       </w:r>
       <w:r>
         <w:rPr>
@@ -4071,6 +4059,7 @@
   <w:style w:type="character" w:default="1" w:styleId="DefaultParagraphFont">
     <w:name w:val="Default Paragraph Font"/>
     <w:uiPriority w:val="1"/>
+    <w:semiHidden/>
     <w:unhideWhenUsed/>
   </w:style>
   <w:style w:type="table" w:default="1" w:styleId="TableNormal">

</xml_diff>

<commit_message>
feat(portfolio): comprehensive content and style updates
- Data & ML Skills: Added TensorFlow, SciPy, LightGBM, and XGBoost; removed 'R'.
- Education Section: Added Alberta AI Academy entry to data and enabled highlight rendering. Updated current learning tagline to "Technical Advancements" with new strategic ML skills.
- UX/UI: Applied alternating background colors across root App sections for better visual flow.
- Alignment: Fixed vertical centering padding on the Hero section and applied `col-start-2` conditional logic to center the lone project card on the final row.
- Content: Updated markdown resume to align with skills changes and updated Footer copyright.
</commit_message>
<xml_diff>
--- a/src/assets/resume/KierVincentOclares_Resume.docx
+++ b/src/assets/resume/KierVincentOclares_Resume.docx
@@ -282,7 +282,7 @@
         <w:rPr>
           <w:rFonts w:ascii="Arial" w:eastAsia="Arial" w:hAnsi="Arial" w:cs="Arial"/>
         </w:rPr>
-        <w:t>Power BI (Advanced DAX &amp; Git Version Control), Tableau, R (Statistical Modeling), Python (Pandas, NumPy, Scikit-learn), Data Visualization.</w:t>
+        <w:t>Power BI (Advanced DAX &amp; Git Version Control), Tableau, Statistical Modeling, Python (Pandas, NumPy, Scikit-learn), Data Visualization.</w:t>
       </w:r>
     </w:p>
     <w:p>
@@ -630,21 +630,7 @@
         <w:rPr>
           <w:rFonts w:ascii="Arial" w:eastAsia="Arial" w:hAnsi="Arial" w:cs="Arial"/>
         </w:rPr>
-        <w:t xml:space="preserve">Developed Python-based ETL scripts to pull data from REST APIs, streamlining pre-processing and </w:t>
-      </w:r>
-      <w:proofErr w:type="gramStart"/>
-      <w:r>
-        <w:rPr>
-          <w:rFonts w:ascii="Arial" w:eastAsia="Arial" w:hAnsi="Arial" w:cs="Arial"/>
-        </w:rPr>
-        <w:t>exploratory</w:t>
-      </w:r>
-      <w:proofErr w:type="gramEnd"/>
-      <w:r>
-        <w:rPr>
-          <w:rFonts w:ascii="Arial" w:eastAsia="Arial" w:hAnsi="Arial" w:cs="Arial"/>
-        </w:rPr>
-        <w:t xml:space="preserve"> data analysis (EDA</w:t>
+        <w:t>Developed Python-based ETL scripts to pull data from REST APIs, streamlining pre-processing and exploratory data analysis (EDA</w:t>
       </w:r>
       <w:r>
         <w:rPr>

</xml_diff>

<commit_message>
chore: update portfolio domain references and refine resume layout
- Update Footer tagline to display the new `kiervoclares.works` domain
- Add `siteUrl` property to the central [Profile](cci:2://file:///c:/Users/count/OneDrive/Documents/Work/Programs/personal-developer-portfolio/src/types/index.ts:23:0-37:1) type definition and data
- Add portfolio URL to the README and markdown resume contact sections
- Refine resume header layout to combine contact links into two clean lines
- Remove the bouncing arrow from the Contact email reveal button ("Psst... click me")
- Regenerate the final PDF resume to include the new domain and layout updates
</commit_message>
<xml_diff>
--- a/src/assets/resume/KierVincentOclares_Resume.docx
+++ b/src/assets/resume/KierVincentOclares_Resume.docx
@@ -158,6 +158,10 @@
     </w:p>
     <w:p>
       <w:pPr>
+        <w:numPr>
+          <w:ilvl w:val="0"/>
+          <w:numId w:val="4"/>
+        </w:numPr>
         <w:pBdr>
           <w:top w:val="nil"/>
           <w:left w:val="nil"/>
@@ -171,6 +175,29 @@
           <w:color w:val="000000"/>
         </w:rPr>
       </w:pPr>
+      <w:r>
+        <w:rPr>
+          <w:rFonts w:ascii="Arial" w:eastAsia="Arial" w:hAnsi="Arial" w:cs="Arial"/>
+          <w:color w:val="000000"/>
+        </w:rPr>
+        <w:t>Portfolio: https://kiervoclares.works/</w:t>
+      </w:r>
+    </w:p>
+    <w:p>
+      <w:pPr>
+        <w:pBdr>
+          <w:top w:val="nil"/>
+          <w:left w:val="nil"/>
+          <w:bottom w:val="nil"/>
+          <w:right w:val="nil"/>
+          <w:between w:val="nil"/>
+        </w:pBdr>
+        <w:spacing w:after="0" w:line="276" w:lineRule="auto"/>
+        <w:rPr>
+          <w:rFonts w:ascii="Arial" w:eastAsia="Arial" w:hAnsi="Arial" w:cs="Arial"/>
+          <w:color w:val="000000"/>
+        </w:rPr>
+      </w:pPr>
     </w:p>
     <w:p>
       <w:pPr>
@@ -537,6 +564,7 @@
         <w:rPr>
           <w:rFonts w:ascii="Arial" w:eastAsia="Arial" w:hAnsi="Arial" w:cs="Arial"/>
         </w:rPr>
+        <w:lastRenderedPageBreak/>
         <w:t>Automated data ingestion from 4+ SQL databases by architecting scalable ETL pipelines using SSIS, integrating thousands of daily row entries and reducing manual reporting efforts by 5+ hours per week.</w:t>
       </w:r>
     </w:p>
@@ -557,7 +585,6 @@
         <w:rPr>
           <w:rFonts w:ascii="Arial" w:eastAsia="Arial" w:hAnsi="Arial" w:cs="Arial"/>
         </w:rPr>
-        <w:lastRenderedPageBreak/>
         <w:t>Modernized financial infrastructure by consolidating multiple legacy Cloud Cost Invoice dashboards into a single unified enterprise dashboard for executive decision support</w:t>
       </w:r>
       <w:r>
@@ -630,7 +657,21 @@
         <w:rPr>
           <w:rFonts w:ascii="Arial" w:eastAsia="Arial" w:hAnsi="Arial" w:cs="Arial"/>
         </w:rPr>
-        <w:t>Developed Python-based ETL scripts to pull data from REST APIs, streamlining pre-processing and exploratory data analysis (EDA</w:t>
+        <w:t xml:space="preserve">Developed Python-based ETL scripts to pull data from REST APIs, streamlining pre-processing and </w:t>
+      </w:r>
+      <w:proofErr w:type="gramStart"/>
+      <w:r>
+        <w:rPr>
+          <w:rFonts w:ascii="Arial" w:eastAsia="Arial" w:hAnsi="Arial" w:cs="Arial"/>
+        </w:rPr>
+        <w:t>exploratory</w:t>
+      </w:r>
+      <w:proofErr w:type="gramEnd"/>
+      <w:r>
+        <w:rPr>
+          <w:rFonts w:ascii="Arial" w:eastAsia="Arial" w:hAnsi="Arial" w:cs="Arial"/>
+        </w:rPr>
+        <w:t xml:space="preserve"> data analysis (EDA</w:t>
       </w:r>
       <w:r>
         <w:rPr>
@@ -992,6 +1033,7 @@
         <w:rPr>
           <w:rFonts w:ascii="Arial" w:eastAsia="Arial" w:hAnsi="Arial" w:cs="Arial"/>
         </w:rPr>
+        <w:lastRenderedPageBreak/>
         <w:t>Ensured strict adherence to quality standards and production tolerances, supporting process improvements that increased throughput.</w:t>
       </w:r>
       <w:bookmarkStart w:id="1" w:name="_heading=h.umjodm18desx" w:colFirst="0" w:colLast="0"/>
@@ -1013,7 +1055,6 @@
           <w:color w:val="000000"/>
           <w:u w:val="single"/>
         </w:rPr>
-        <w:lastRenderedPageBreak/>
         <w:t>EDUCATION</w:t>
       </w:r>
     </w:p>

</xml_diff>

<commit_message>
feat(projects): add Grant AI Reviewer and internal project UI
- Added `subtitle`, `role`, `organization`, `environment`, and `isInternal` optional fields to [Project](cci:2://file:///c:/Users/count/OneDrive/Documents/Work/Programs/personal-developer-portfolio/src/types/index.ts:74:0-89:1) interface
- Embedded 'Grant AI Reviewer' project data into portfolio
- Removed 'Cloud Cost Explainer Tool' from project timeline
- Designed an orange 'Internal Project' badge with a Lock icon for internal application privacy
- Updated standard project badges to fall back to 'Personal Project' and 'Academic Project'
- Added a toggleable 'View my role' list element for displaying explicit contributions on a project
- Updated `KierVincentOclares_Resume.md` versions with the Grant AI Reviewer summary
</commit_message>
<xml_diff>
--- a/src/assets/resume/KierVincentOclares_Resume.docx
+++ b/src/assets/resume/KierVincentOclares_Resume.docx
@@ -657,21 +657,7 @@
         <w:rPr>
           <w:rFonts w:ascii="Arial" w:eastAsia="Arial" w:hAnsi="Arial" w:cs="Arial"/>
         </w:rPr>
-        <w:t xml:space="preserve">Developed Python-based ETL scripts to pull data from REST APIs, streamlining pre-processing and </w:t>
-      </w:r>
-      <w:proofErr w:type="gramStart"/>
-      <w:r>
-        <w:rPr>
-          <w:rFonts w:ascii="Arial" w:eastAsia="Arial" w:hAnsi="Arial" w:cs="Arial"/>
-        </w:rPr>
-        <w:t>exploratory</w:t>
-      </w:r>
-      <w:proofErr w:type="gramEnd"/>
-      <w:r>
-        <w:rPr>
-          <w:rFonts w:ascii="Arial" w:eastAsia="Arial" w:hAnsi="Arial" w:cs="Arial"/>
-        </w:rPr>
-        <w:t xml:space="preserve"> data analysis (EDA</w:t>
+        <w:t>Developed Python-based ETL scripts to pull data from REST APIs, streamlining pre-processing and exploratory data analysis (EDA</w:t>
       </w:r>
       <w:r>
         <w:rPr>
@@ -1447,6 +1433,61 @@
           <w:u w:val="single"/>
         </w:rPr>
         <w:t>ADVANCED ANALYTICS INITIATIVES</w:t>
+      </w:r>
+    </w:p>
+    <w:p>
+      <w:pPr>
+        <w:spacing w:before="200" w:after="0"/>
+        <w:jc w:val="both"/>
+        <w:rPr>
+          <w:rFonts w:ascii="Arial" w:eastAsia="Arial" w:hAnsi="Arial" w:cs="Arial"/>
+          <w:i/>
+          <w:iCs/>
+        </w:rPr>
+      </w:pPr>
+      <w:r>
+        <w:rPr>
+          <w:rFonts w:ascii="Arial" w:eastAsia="Arial" w:hAnsi="Arial" w:cs="Arial"/>
+          <w:b/>
+          <w:bCs/>
+        </w:rPr>
+        <w:t>Grant AI Reviewer</w:t>
+      </w:r>
+      <w:r>
+        <w:rPr>
+          <w:rFonts w:ascii="Arial" w:eastAsia="Arial" w:hAnsi="Arial" w:cs="Arial"/>
+          <w:b/>
+          <w:bCs/>
+        </w:rPr>
+        <w:t xml:space="preserve">, </w:t>
+      </w:r>
+      <w:r>
+        <w:rPr>
+          <w:rFonts w:ascii="Arial" w:eastAsia="Arial" w:hAnsi="Arial" w:cs="Arial"/>
+          <w:b/>
+          <w:bCs/>
+        </w:rPr>
+        <w:t>Government of Alberta</w:t>
+      </w:r>
+    </w:p>
+    <w:p>
+      <w:pPr>
+        <w:pStyle w:val="ListParagraph"/>
+        <w:numPr>
+          <w:ilvl w:val="0"/>
+          <w:numId w:val="12"/>
+        </w:numPr>
+        <w:spacing w:before="200" w:after="0"/>
+        <w:jc w:val="both"/>
+        <w:rPr>
+          <w:rFonts w:ascii="Arial" w:eastAsia="Arial" w:hAnsi="Arial" w:cs="Arial"/>
+        </w:rPr>
+      </w:pPr>
+      <w:r>
+        <w:rPr>
+          <w:rFonts w:ascii="Arial" w:eastAsia="Arial" w:hAnsi="Arial" w:cs="Arial"/>
+        </w:rPr>
+        <w:t>Designed and executed end-to-end testing of an AI-powered grant application reviewer. Validated system behavior across OCR extraction layers, structured prompt evaluation consistency, and a React interface. Proposed improvements to evaluation prompts, increasing AI decision accuracy and reducing false positives for human-in-the-loop reviewers.</w:t>
       </w:r>
     </w:p>
     <w:p>

</xml_diff>